<commit_message>
Add Google Workspace administration and agency role; fix cert inconsistency
Keep the Workspace admin skill anchored to the agency, which is current and
verifiable, rather than listing the short Digital Discovery Network stint whose
status is unknown. Add the agency and NYC Law Department entries to the website
so it matches the resume, and correct the site's certification line from
CompTIA A+ to Security+.

Co-Authored-By: Claude Opus 4.8 <noreply@anthropic.com>
Claude-Session: https://claude.ai/code/session_01VfgU3xteRNVWS46v6TXs6z
</commit_message>
<xml_diff>
--- a/Chinedu_Ezeofor_Resume.docx
+++ b/Chinedu_Ezeofor_Resume.docx
@@ -280,6 +280,16 @@
         <w:ind w:left="317"/>
       </w:pPr>
       <w:r>
+        <w:t>Administer the agency's Google Workspace: users, domain and business email setup.</w:t>
+      </w:r>
+    </w:p>
+    <w:p>
+      <w:pPr>
+        <w:pStyle w:val="ListBullet"/>
+        <w:spacing w:after="40"/>
+        <w:ind w:left="317"/>
+      </w:pPr>
+      <w:r>
         <w:t>Built a Make.com workflow that takes Facebook group join requests, verifies the email address, and passes everyone who clears into a clean marketing list.</w:t>
       </w:r>
     </w:p>
@@ -364,7 +374,7 @@
         <w:t xml:space="preserve">Identity &amp; access: </w:t>
       </w:r>
       <w:r>
-        <w:t>Active Directory (Windows Server AD DS), Microsoft 365, Duo MFA, account provisioning, group and shared mailbox access</w:t>
+        <w:t>Active Directory (Windows Server AD DS), Microsoft 365, Google Workspace administration, Duo MFA, account provisioning, group and shared mailbox access</w:t>
       </w:r>
     </w:p>
     <w:p>

</xml_diff>

<commit_message>
Add infrastructure projects and an automation-focused resume variant
Record the self-hosted work honestly: a Stalwart mail server that is running but
not fully configured, DNS management (MX, SPF, DKIM) on a personal domain, and a
Vercel deployment. These are the strongest evidence of hands-on technical
ability, since the day job's access is capped.

Add resume-automation.md, a variant that leads with the Make.com, n8n and OpenAI
API work for automation and AI-ops roles, with the service desk supporting it.

Replace build_resume_docx.py with md2docx.py so both resumes render from their
markdown source instead of duplicating content in a script.

Co-Authored-By: Claude Opus 4.8 <noreply@anthropic.com>
Claude-Session: https://claude.ai/code/session_01VfgU3xteRNVWS46v6TXs6z
</commit_message>
<xml_diff>
--- a/Chinedu_Ezeofor_Resume.docx
+++ b/Chinedu_Ezeofor_Resume.docx
@@ -29,14 +29,10 @@
     </w:p>
     <w:p>
       <w:pPr>
-        <w:spacing w:after="80"/>
-        <w:jc w:val="center"/>
+        <w:spacing w:after="60"/>
       </w:pPr>
       <w:r>
-        <w:rPr>
-          <w:sz w:val="19"/>
-        </w:rPr>
-        <w:t>New York, NY  |  chinedu@interactxp.com  |  linkedin.com/in/c-ezeofor90</w:t>
+        <w:t>New York, NY | chinedu@interactxp.com | linkedin.com/in/c-ezeofor90</w:t>
       </w:r>
     </w:p>
     <w:p>
@@ -57,7 +53,7 @@
     </w:p>
     <w:p>
       <w:pPr>
-        <w:spacing w:after="40"/>
+        <w:spacing w:after="60"/>
       </w:pPr>
       <w:r>
         <w:t>Service desk analyst working in IT support since 2021, currently covering the weekend shift for a healthcare client with 1,000+ users. Most of my day is Active Directory, Epic, MyChart and Microsoft 365 - creating accounts, clearing blocks, verifying who I'm actually talking to before I change anything, and talking users through software changes they didn't ask for. Outside of work I build automations in Make.com and n8n and run a small digital agency in NYC. Studying for Security+.</w:t>
@@ -88,7 +84,7 @@
           <w:b/>
           <w:sz w:val="21"/>
         </w:rPr>
-        <w:t>Service Desk Analyst II - Matrix Global Services</w:t>
+        <w:t>Matrix Global Services - Service Desk Analyst II</w:t>
       </w:r>
     </w:p>
     <w:p>
@@ -175,14 +171,10 @@
     </w:p>
     <w:p>
       <w:pPr>
-        <w:spacing w:before="40"/>
+        <w:spacing w:after="60"/>
       </w:pPr>
       <w:r>
-        <w:rPr>
-          <w:i/>
-          <w:sz w:val="18"/>
-        </w:rPr>
-        <w:t>Environment: Citrix Workspace, internal RDP, Zoho Assist, FreshService, Active Directory, Microsoft 365, Epic, MyChart, Healthstream, Duo</w:t>
+        <w:t>Environment: Citrix Workspace | internal RDP | Zoho Assist | FreshService | Active Directory | Microsoft 365 | Epic | MyChart | Healthstream | Duo</w:t>
       </w:r>
     </w:p>
     <w:p>
@@ -194,7 +186,7 @@
           <w:b/>
           <w:sz w:val="21"/>
         </w:rPr>
-        <w:t>IT Support Specialist (Google x Multiverse Apprenticeship) - Google</w:t>
+        <w:t>Google - IT Support Specialist (Google x Multiverse Apprenticeship)</w:t>
       </w:r>
     </w:p>
     <w:p>
@@ -248,7 +240,7 @@
           <w:b/>
           <w:sz w:val="21"/>
         </w:rPr>
-        <w:t>Founder - Interactive Xperience Agency</w:t>
+        <w:t>Interactive Xperience Agency - Founder</w:t>
       </w:r>
     </w:p>
     <w:p>
@@ -312,7 +304,7 @@
           <w:b/>
           <w:sz w:val="21"/>
         </w:rPr>
-        <w:t>Clerical Support - New York City Law Department</w:t>
+        <w:t>New York City Law Department - Clerical Support</w:t>
       </w:r>
     </w:p>
     <w:p>
@@ -365,86 +357,72 @@
     </w:p>
     <w:p>
       <w:pPr>
-        <w:spacing w:after="20"/>
+        <w:pStyle w:val="ListBullet"/>
+        <w:spacing w:after="40"/>
+        <w:ind w:left="317"/>
       </w:pPr>
       <w:r>
-        <w:rPr>
-          <w:b/>
-        </w:rPr>
-        <w:t xml:space="preserve">Identity &amp; access: </w:t>
-      </w:r>
-      <w:r>
-        <w:t>Active Directory (Windows Server AD DS), Microsoft 365, Google Workspace administration, Duo MFA, account provisioning, group and shared mailbox access</w:t>
+        <w:t>Identity &amp; access: Active Directory (Windows Server AD DS), Microsoft 365, Google Workspace administration, Duo MFA, account provisioning, group and shared mailbox access</w:t>
       </w:r>
     </w:p>
     <w:p>
       <w:pPr>
-        <w:spacing w:after="20"/>
+        <w:pStyle w:val="ListBullet"/>
+        <w:spacing w:after="40"/>
+        <w:ind w:left="317"/>
       </w:pPr>
       <w:r>
-        <w:rPr>
-          <w:b/>
-        </w:rPr>
-        <w:t xml:space="preserve">Service desk: </w:t>
-      </w:r>
-      <w:r>
-        <w:t>FreshService (ITSM), Zoho Assist, Citrix Workspace, remote desktop, ticket triage and escalation</w:t>
+        <w:t>Service desk: FreshService (ITSM), Zoho Assist, Citrix Workspace, remote desktop, ticket triage and escalation</w:t>
       </w:r>
     </w:p>
     <w:p>
       <w:pPr>
-        <w:spacing w:after="20"/>
+        <w:pStyle w:val="ListBullet"/>
+        <w:spacing w:after="40"/>
+        <w:ind w:left="317"/>
       </w:pPr>
       <w:r>
-        <w:rPr>
-          <w:b/>
-        </w:rPr>
-        <w:t xml:space="preserve">Healthcare systems: </w:t>
-      </w:r>
-      <w:r>
-        <w:t>Epic, MyChart, Healthstream</w:t>
+        <w:t>Healthcare systems: Epic, MyChart, Healthstream</w:t>
       </w:r>
     </w:p>
     <w:p>
       <w:pPr>
-        <w:spacing w:after="20"/>
+        <w:pStyle w:val="ListBullet"/>
+        <w:spacing w:after="40"/>
+        <w:ind w:left="317"/>
       </w:pPr>
       <w:r>
-        <w:rPr>
-          <w:b/>
-        </w:rPr>
-        <w:t xml:space="preserve">Platforms: </w:t>
-      </w:r>
-      <w:r>
-        <w:t>Windows, macOS, iOS, Android</w:t>
+        <w:t>Platforms: Windows, macOS, iOS, Android</w:t>
       </w:r>
     </w:p>
     <w:p>
       <w:pPr>
-        <w:spacing w:after="20"/>
+        <w:pStyle w:val="ListBullet"/>
+        <w:spacing w:after="40"/>
+        <w:ind w:left="317"/>
       </w:pPr>
       <w:r>
-        <w:rPr>
-          <w:b/>
-        </w:rPr>
-        <w:t xml:space="preserve">Networking: </w:t>
-      </w:r>
-      <w:r>
-        <w:t>TCP/IP, DNS, DHCP, VPN, LAN/Wi-Fi, ping / ipconfig / nslookup / tracert</w:t>
+        <w:t>Networking &amp; DNS: TCP/IP, DNS record management (MX, SPF, DKIM, CNAME, A, TXT), DHCP, VPN, LAN/Wi-Fi, ping / ipconfig / nslookup / tracert</w:t>
       </w:r>
     </w:p>
     <w:p>
       <w:pPr>
-        <w:spacing w:after="20"/>
+        <w:pStyle w:val="ListBullet"/>
+        <w:spacing w:after="40"/>
+        <w:ind w:left="317"/>
       </w:pPr>
       <w:r>
-        <w:rPr>
-          <w:b/>
-        </w:rPr>
-        <w:t xml:space="preserve">Automation &amp; AI: </w:t>
+        <w:t>Hosting: Vercel, self-hosted services (Stalwart mail server), domain configuration</w:t>
       </w:r>
+    </w:p>
+    <w:p>
+      <w:pPr>
+        <w:pStyle w:val="ListBullet"/>
+        <w:spacing w:after="40"/>
+        <w:ind w:left="317"/>
+      </w:pPr>
       <w:r>
-        <w:t>Make.com, n8n, OpenAI API, no-code databases, prompt writing</w:t>
+        <w:t>Automation &amp; AI: Make.com, n8n, OpenAI API, no-code databases, prompt writing</w:t>
       </w:r>
     </w:p>
     <w:p>
@@ -497,6 +475,36 @@
           <w:sz w:val="21"/>
         </w:rPr>
         <w:t>PROJECTS</w:t>
+      </w:r>
+    </w:p>
+    <w:p>
+      <w:pPr>
+        <w:pStyle w:val="ListBullet"/>
+        <w:spacing w:after="40"/>
+        <w:ind w:left="317"/>
+      </w:pPr>
+      <w:r>
+        <w:t>Standing up a self-hosted Stalwart mail server - running now, still working through full configuration.</w:t>
+      </w:r>
+    </w:p>
+    <w:p>
+      <w:pPr>
+        <w:pStyle w:val="ListBullet"/>
+        <w:spacing w:after="40"/>
+        <w:ind w:left="317"/>
+      </w:pPr>
+      <w:r>
+        <w:t>Manage DNS for my own domain: MX, SPF and DKIM records for mail delivery and authentication.</w:t>
+      </w:r>
+    </w:p>
+    <w:p>
+      <w:pPr>
+        <w:pStyle w:val="ListBullet"/>
+        <w:spacing w:after="40"/>
+        <w:ind w:left="317"/>
+      </w:pPr>
+      <w:r>
+        <w:t>Deployed the agency site on Vercel, including domain and DNS setup.</w:t>
       </w:r>
     </w:p>
     <w:p>

</xml_diff>